<commit_message>
Deploy preview for PR 109 🛫
</commit_message>
<xml_diff>
--- a/pr-preview/pr-109/vignettes/articles/quarto_article.docx
+++ b/pr-preview/pr-109/vignettes/articles/quarto_article.docx
@@ -23,7 +23,7 @@
         <w:pStyle w:val="Date"/>
       </w:pPr>
       <w:r>
-        <w:t xml:space="preserve">2026-04-30</w:t>
+        <w:t xml:space="preserve">2026-05-04</w:t>
       </w:r>
     </w:p>
     <w:p>
@@ -3301,13 +3301,1736 @@
       </w:r>
     </w:p>
     <w:bookmarkEnd w:id="37"/>
-    <w:bookmarkStart w:id="38" w:name="mathematical-notation"/>
+    <w:bookmarkStart w:id="50" w:name="theorem-environments"/>
     <w:p>
       <w:pPr>
         <w:pStyle w:val="Heading2"/>
       </w:pPr>
       <w:r>
-        <w:t xml:space="preserve">6 Mathematical Notation</w:t>
+        <w:t xml:space="preserve">6 Theorem Environments</w:t>
+      </w:r>
+    </w:p>
+    <w:p>
+      <w:pPr>
+        <w:pStyle w:val="FirstParagraph"/>
+      </w:pPr>
+      <w:r>
+        <w:t xml:space="preserve">The</w:t>
+      </w:r>
+      <w:r>
+        <w:t xml:space="preserve"> </w:t>
+      </w:r>
+      <w:r>
+        <w:rPr>
+          <w:rStyle w:val="VerbatimChar"/>
+        </w:rPr>
+        <w:t xml:space="preserve">callouty-theorem</w:t>
+      </w:r>
+      <w:r>
+        <w:t xml:space="preserve"> </w:t>
+      </w:r>
+      <w:r>
+        <w:t xml:space="preserve">extension renders Quarto theorem and proof environments as styled callout blocks. This makes theorems, definitions, examples, and proofs visually distinct and easier to navigate.</w:t>
+      </w:r>
+    </w:p>
+    <w:bookmarkStart w:id="43" w:name="definitions-and-theorems"/>
+    <w:p>
+      <w:pPr>
+        <w:pStyle w:val="Heading3"/>
+      </w:pPr>
+      <w:r>
+        <w:t xml:space="preserve">6.1 Definitions and Theorems</w:t>
+      </w:r>
+    </w:p>
+    <w:tbl>
+      <w:tblPr>
+        <w:tblStyle w:val="Table"/>
+        <w:tblInd w:w="164" w:type="dxa"/>
+        <w:tblBorders>
+          <w:left w:val="single" w:sz="24" w:space="0" w:color="00A047"/>
+        </w:tblBorders>
+        <w:tblCellMar>
+          <w:left w:w="0" w:type="dxa"/>
+          <w:right w:w="0" w:type="dxa"/>
+        </w:tblCellMar>
+        <w:tblLook w:firstRow="0" w:lastRow="0" w:firstColumn="0" w:lastColumn="0" w:noHBand="0" w:noVBand="0" w:val="0000"/>
+      </w:tblPr>
+      <w:tblGrid>
+        <w:gridCol w:w="7920"/>
+      </w:tblGrid>
+      <w:tr>
+        <w:trPr>
+          <w:cantSplit/>
+        </w:trPr>
+        <w:tc>
+          <w:tcPr>
+            <w:tcMar>
+              <w:left w:w="144" w:type="dxa"/>
+            </w:tcMar>
+          </w:tcPr>
+          <w:p>
+            <w:pPr>
+              <w:pStyle w:val="FirstParagraph"/>
+            </w:pPr>
+            <w:pPr>
+              <w:spacing w:before="16" w:after="64"/>
+            </w:pPr>
+          </w:p>
+          <w:bookmarkStart w:id="38" w:name="def-se"/>
+          <w:p>
+            <w:pPr>
+              <w:pStyle w:val="BodyText"/>
+            </w:pPr>
+            <w:r>
+              <w:rPr>
+                <w:b/>
+                <w:bCs/>
+              </w:rPr>
+              <w:t xml:space="preserve">Definition 1 (Standard Error)</w:t>
+            </w:r>
+            <w:r>
+              <w:t xml:space="preserve"> </w:t>
+            </w:r>
+            <w:r>
+              <w:t xml:space="preserve">The</w:t>
+            </w:r>
+            <w:r>
+              <w:t xml:space="preserve"> </w:t>
+            </w:r>
+            <w:r>
+              <w:rPr>
+                <w:b/>
+                <w:bCs/>
+              </w:rPr>
+              <w:t xml:space="preserve">standard error</w:t>
+            </w:r>
+            <w:r>
+              <w:t xml:space="preserve"> </w:t>
+            </w:r>
+            <w:r>
+              <w:t xml:space="preserve">of the mean for a sample of size</w:t>
+            </w:r>
+            <w:r>
+              <w:t xml:space="preserve"> </w:t>
+            </w:r>
+            <m:oMath>
+              <m:r>
+                <m:t>n</m:t>
+              </m:r>
+            </m:oMath>
+            <w:r>
+              <w:t xml:space="preserve"> </w:t>
+            </w:r>
+            <w:r>
+              <w:t xml:space="preserve">with standard deviation</w:t>
+            </w:r>
+            <w:r>
+              <w:t xml:space="preserve"> </w:t>
+            </w:r>
+            <m:oMath>
+              <m:r>
+                <m:t>s</m:t>
+              </m:r>
+            </m:oMath>
+            <w:r>
+              <w:t xml:space="preserve"> </w:t>
+            </w:r>
+            <w:r>
+              <w:t xml:space="preserve">is:</w:t>
+            </w:r>
+          </w:p>
+          <w:p>
+            <w:pPr>
+              <w:pStyle w:val="BodyText"/>
+            </w:pPr>
+            <m:oMathPara>
+              <m:oMathParaPr>
+                <m:jc m:val="center"/>
+              </m:oMathParaPr>
+              <m:oMath>
+                <m:r>
+                  <m:t>S</m:t>
+                </m:r>
+                <m:r>
+                  <m:t>E</m:t>
+                </m:r>
+                <m:r>
+                  <m:rPr>
+                    <m:sty m:val="p"/>
+                  </m:rPr>
+                  <m:t>=</m:t>
+                </m:r>
+                <m:f>
+                  <m:fPr>
+                    <m:type m:val="bar"/>
+                  </m:fPr>
+                  <m:num>
+                    <m:r>
+                      <m:t>s</m:t>
+                    </m:r>
+                  </m:num>
+                  <m:den>
+                    <m:rad>
+                      <m:radPr>
+                        <m:degHide m:val="on"/>
+                      </m:radPr>
+                      <m:deg/>
+                      <m:e>
+                        <m:r>
+                          <m:t>n</m:t>
+                        </m:r>
+                      </m:e>
+                    </m:rad>
+                  </m:den>
+                </m:f>
+              </m:oMath>
+            </m:oMathPara>
+          </w:p>
+          <w:bookmarkEnd w:id="38"/>
+        </w:tc>
+      </w:tr>
+    </w:tbl>
+    <w:p>
+      <w:pPr>
+        <w:pStyle w:val="FirstParagraph"/>
+      </w:pPr>
+      <w:r>
+        <w:t xml:space="preserve"> </w:t>
+      </w:r>
+    </w:p>
+    <w:tbl>
+      <w:tblPr>
+        <w:tblStyle w:val="Table"/>
+        <w:tblInd w:w="164" w:type="dxa"/>
+        <w:tblBorders>
+          <w:left w:val="single" w:sz="24" w:space="0" w:color="0758E5"/>
+        </w:tblBorders>
+        <w:tblCellMar>
+          <w:left w:w="0" w:type="dxa"/>
+          <w:right w:w="0" w:type="dxa"/>
+        </w:tblCellMar>
+        <w:tblLook w:firstRow="0" w:lastRow="0" w:firstColumn="0" w:lastColumn="0" w:noHBand="0" w:noVBand="0" w:val="0000"/>
+      </w:tblPr>
+      <w:tblGrid>
+        <w:gridCol w:w="7920"/>
+      </w:tblGrid>
+      <w:tr>
+        <w:trPr>
+          <w:cantSplit/>
+        </w:trPr>
+        <w:tc>
+          <w:tcPr>
+            <w:tcMar>
+              <w:left w:w="144" w:type="dxa"/>
+            </w:tcMar>
+          </w:tcPr>
+          <w:p>
+            <w:pPr>
+              <w:pStyle w:val="BodyText"/>
+            </w:pPr>
+            <w:pPr>
+              <w:spacing w:before="16" w:after="64"/>
+            </w:pPr>
+          </w:p>
+          <w:bookmarkStart w:id="39" w:name="thm-clt"/>
+          <w:p>
+            <w:pPr>
+              <w:pStyle w:val="BodyText"/>
+            </w:pPr>
+            <w:r>
+              <w:rPr>
+                <w:b/>
+                <w:bCs/>
+              </w:rPr>
+              <w:t xml:space="preserve">Theorem 1 (Central Limit Theorem)</w:t>
+            </w:r>
+            <w:r>
+              <w:t xml:space="preserve"> </w:t>
+            </w:r>
+            <w:r>
+              <w:t xml:space="preserve">Let</w:t>
+            </w:r>
+            <w:r>
+              <w:t xml:space="preserve"> </w:t>
+            </w:r>
+            <m:oMath>
+              <m:sSub>
+                <m:e>
+                  <m:r>
+                    <m:t>X</m:t>
+                  </m:r>
+                </m:e>
+                <m:sub>
+                  <m:r>
+                    <m:t>1</m:t>
+                  </m:r>
+                </m:sub>
+              </m:sSub>
+              <m:r>
+                <m:rPr>
+                  <m:sty m:val="p"/>
+                </m:rPr>
+                <m:t>,</m:t>
+              </m:r>
+              <m:sSub>
+                <m:e>
+                  <m:r>
+                    <m:t>X</m:t>
+                  </m:r>
+                </m:e>
+                <m:sub>
+                  <m:r>
+                    <m:t>2</m:t>
+                  </m:r>
+                </m:sub>
+              </m:sSub>
+              <m:r>
+                <m:rPr>
+                  <m:sty m:val="p"/>
+                </m:rPr>
+                <m:t>,</m:t>
+              </m:r>
+              <m:r>
+                <m:rPr>
+                  <m:sty m:val="p"/>
+                </m:rPr>
+                <m:t>…</m:t>
+              </m:r>
+              <m:r>
+                <m:rPr>
+                  <m:sty m:val="p"/>
+                </m:rPr>
+                <m:t>,</m:t>
+              </m:r>
+              <m:sSub>
+                <m:e>
+                  <m:r>
+                    <m:t>X</m:t>
+                  </m:r>
+                </m:e>
+                <m:sub>
+                  <m:r>
+                    <m:t>n</m:t>
+                  </m:r>
+                </m:sub>
+              </m:sSub>
+            </m:oMath>
+            <w:r>
+              <w:t xml:space="preserve"> </w:t>
+            </w:r>
+            <w:r>
+              <w:t xml:space="preserve">be independent and identically distributed random variables with mean</w:t>
+            </w:r>
+            <w:r>
+              <w:t xml:space="preserve"> </w:t>
+            </w:r>
+            <m:oMath>
+              <m:r>
+                <m:t>μ</m:t>
+              </m:r>
+            </m:oMath>
+            <w:r>
+              <w:t xml:space="preserve"> </w:t>
+            </w:r>
+            <w:r>
+              <w:t xml:space="preserve">and finite variance</w:t>
+            </w:r>
+            <w:r>
+              <w:t xml:space="preserve"> </w:t>
+            </w:r>
+            <m:oMath>
+              <m:sSup>
+                <m:e>
+                  <m:r>
+                    <m:t>σ</m:t>
+                  </m:r>
+                </m:e>
+                <m:sup>
+                  <m:r>
+                    <m:t>2</m:t>
+                  </m:r>
+                </m:sup>
+              </m:sSup>
+            </m:oMath>
+            <w:r>
+              <w:t xml:space="preserve">. Then as</w:t>
+            </w:r>
+            <w:r>
+              <w:t xml:space="preserve"> </w:t>
+            </w:r>
+            <m:oMath>
+              <m:r>
+                <m:t>n</m:t>
+              </m:r>
+              <m:r>
+                <m:rPr>
+                  <m:sty m:val="p"/>
+                </m:rPr>
+                <m:t>→</m:t>
+              </m:r>
+              <m:r>
+                <m:rPr>
+                  <m:sty m:val="p"/>
+                </m:rPr>
+                <m:t>∞</m:t>
+              </m:r>
+            </m:oMath>
+            <w:r>
+              <w:t xml:space="preserve">:</w:t>
+            </w:r>
+          </w:p>
+          <w:p>
+            <w:pPr>
+              <w:pStyle w:val="BodyText"/>
+            </w:pPr>
+            <m:oMathPara>
+              <m:oMathParaPr>
+                <m:jc m:val="center"/>
+              </m:oMathParaPr>
+              <m:oMath>
+                <m:f>
+                  <m:fPr>
+                    <m:type m:val="bar"/>
+                  </m:fPr>
+                  <m:num>
+                    <m:acc>
+                      <m:accPr>
+                        <m:chr m:val="‾"/>
+                      </m:accPr>
+                      <m:e>
+                        <m:r>
+                          <m:t>X</m:t>
+                        </m:r>
+                      </m:e>
+                    </m:acc>
+                    <m:r>
+                      <m:rPr>
+                        <m:sty m:val="p"/>
+                      </m:rPr>
+                      <m:t>−</m:t>
+                    </m:r>
+                    <m:r>
+                      <m:t>μ</m:t>
+                    </m:r>
+                  </m:num>
+                  <m:den>
+                    <m:r>
+                      <m:t>σ</m:t>
+                    </m:r>
+                    <m:r>
+                      <m:rPr>
+                        <m:sty m:val="p"/>
+                      </m:rPr>
+                      <m:t>/</m:t>
+                    </m:r>
+                    <m:rad>
+                      <m:radPr>
+                        <m:degHide m:val="on"/>
+                      </m:radPr>
+                      <m:deg/>
+                      <m:e>
+                        <m:r>
+                          <m:t>n</m:t>
+                        </m:r>
+                      </m:e>
+                    </m:rad>
+                  </m:den>
+                </m:f>
+                <m:limUpp>
+                  <m:e>
+                    <m:r>
+                      <m:rPr>
+                        <m:sty m:val="p"/>
+                      </m:rPr>
+                      <m:t>→</m:t>
+                    </m:r>
+                  </m:e>
+                  <m:lim>
+                    <m:r>
+                      <m:t>d</m:t>
+                    </m:r>
+                  </m:lim>
+                </m:limUpp>
+                <m:r>
+                  <m:t>N</m:t>
+                </m:r>
+                <m:r>
+                  <m:rPr>
+                    <m:sty m:val="p"/>
+                  </m:rPr>
+                  <m:t>(</m:t>
+                </m:r>
+                <m:r>
+                  <m:t>0</m:t>
+                </m:r>
+                <m:r>
+                  <m:rPr>
+                    <m:sty m:val="p"/>
+                  </m:rPr>
+                  <m:t>,</m:t>
+                </m:r>
+                <m:r>
+                  <m:t>1</m:t>
+                </m:r>
+                <m:r>
+                  <m:rPr>
+                    <m:sty m:val="p"/>
+                  </m:rPr>
+                  <m:t>)</m:t>
+                </m:r>
+              </m:oMath>
+            </m:oMathPara>
+          </w:p>
+          <w:bookmarkEnd w:id="39"/>
+        </w:tc>
+      </w:tr>
+    </w:tbl>
+    <w:p>
+      <w:pPr>
+        <w:pStyle w:val="FirstParagraph"/>
+      </w:pPr>
+      <w:r>
+        <w:t xml:space="preserve"> </w:t>
+      </w:r>
+    </w:p>
+    <w:tbl>
+      <w:tblPr>
+        <w:tblStyle w:val="Table"/>
+        <w:tblLook w:firstRow="0" w:lastRow="0" w:firstColumn="0" w:lastColumn="0" w:noHBand="0" w:noVBand="0" w:val="0000"/>
+        <w:tblBorders>
+          <w:top w:val="single" w:sz="4" w:space="0" w:color="0758E5"/>
+          <w:left w:val="single" w:sz="24" w:space="0" w:color="0758E5"/>
+          <w:bottom w:val="single" w:sz="4" w:space="0" w:color="0758E5"/>
+          <w:right w:val="single" w:sz="4" w:space="0" w:color="0758E5"/>
+        </w:tblBorders>
+        <w:tblCellMar>
+          <w:left w:w="144" w:type="dxa"/>
+          <w:right w:w="144" w:type="dxa"/>
+        </w:tblCellMar>
+        <w:tblLook w:firstRow="0" w:lastRow="0" w:firstColumn="0" w:lastColumn="0" w:noHBand="0" w:noVBand="0" w:val="0000"/>
+      </w:tblPr>
+      <w:tr>
+        <w:trPr>
+          <w:cantSplit/>
+        </w:trPr>
+        <w:tc>
+          <w:tcPr>
+            <w:shd w:color="auto" w:fill="dae6fb" w:val="clear"/>
+            <w:tcMar>
+              <w:top w:w="92" w:type="dxa"/>
+              <w:bottom w:w="92" w:type="dxa"/>
+            </w:tcMar>
+          </w:tcPr>
+          <w:p>
+            <w:pPr>
+              <w:pStyle w:val="BodyText"/>
+            </w:pPr>
+            <w:pPr>
+              <w:spacing w:before="0" w:after="0"/>
+              <w:textAlignment w:val="center"/>
+            </w:pPr>
+            <w:r>
+              <w:drawing>
+                <wp:inline>
+                  <wp:extent cx="152400" cy="152400"/>
+                  <wp:effectExtent b="0" l="0" r="0" t="0"/>
+                  <wp:docPr descr="" title="" id="41" name="Picture"/>
+                  <a:graphic>
+                    <a:graphicData uri="http://schemas.openxmlformats.org/drawingml/2006/picture">
+                      <pic:pic>
+                        <pic:nvPicPr>
+                          <pic:cNvPr descr="/opt/quarto/share/formats/docx/note.png" id="42" name="Picture"/>
+                          <pic:cNvPicPr>
+                            <a:picLocks noChangeArrowheads="1" noChangeAspect="1"/>
+                          </pic:cNvPicPr>
+                        </pic:nvPicPr>
+                        <pic:blipFill>
+                          <a:blip r:embed="rId40"/>
+                          <a:stretch>
+                            <a:fillRect/>
+                          </a:stretch>
+                        </pic:blipFill>
+                        <pic:spPr bwMode="auto">
+                          <a:xfrm>
+                            <a:off x="0" y="0"/>
+                            <a:ext cx="152400" cy="152400"/>
+                          </a:xfrm>
+                          <a:prstGeom prst="rect">
+                            <a:avLst/>
+                          </a:prstGeom>
+                          <a:noFill/>
+                          <a:ln w="9525">
+                            <a:noFill/>
+                            <a:headEnd/>
+                            <a:tailEnd/>
+                          </a:ln>
+                        </pic:spPr>
+                      </pic:pic>
+                    </a:graphicData>
+                  </a:graphic>
+                </wp:inline>
+              </w:drawing>
+            </w:r>
+            <w:r>
+              <w:t xml:space="preserve"> </w:t>
+            </w:r>
+            <w:r>
+              <w:t xml:space="preserve"> </w:t>
+            </w:r>
+            <w:r>
+              <w:t xml:space="preserve">Proof</w:t>
+            </w:r>
+          </w:p>
+        </w:tc>
+      </w:tr>
+      <w:tr>
+        <w:trPr>
+          <w:cantSplit/>
+        </w:trPr>
+        <w:tc>
+          <w:tcPr>
+            <w:tcMar>
+              <w:top w:w="108" w:type="dxa"/>
+              <w:bottom w:w="108" w:type="dxa"/>
+            </w:tcMar>
+          </w:tcPr>
+          <w:p>
+            <w:pPr>
+              <w:pStyle w:val="BodyText"/>
+            </w:pPr>
+            <w:r>
+              <w:rPr>
+                <w:i/>
+                <w:iCs/>
+              </w:rPr>
+              <w:t xml:space="preserve">Proof</w:t>
+            </w:r>
+            <w:r>
+              <w:t xml:space="preserve">. </w:t>
+            </w:r>
+            <w:r>
+              <w:t xml:space="preserve">See any standard probability textbook.</w:t>
+            </w:r>
+          </w:p>
+          <w:p/>
+        </w:tc>
+      </w:tr>
+    </w:tbl>
+    <w:bookmarkEnd w:id="43"/>
+    <w:bookmarkStart w:id="46" w:name="lemmas-and-corollaries"/>
+    <w:p>
+      <w:pPr>
+        <w:pStyle w:val="Heading3"/>
+      </w:pPr>
+      <w:r>
+        <w:t xml:space="preserve">6.2 Lemmas and Corollaries</w:t>
+      </w:r>
+    </w:p>
+    <w:tbl>
+      <w:tblPr>
+        <w:tblStyle w:val="Table"/>
+        <w:tblInd w:w="164" w:type="dxa"/>
+        <w:tblBorders>
+          <w:left w:val="single" w:sz="24" w:space="0" w:color="0758E5"/>
+        </w:tblBorders>
+        <w:tblCellMar>
+          <w:left w:w="0" w:type="dxa"/>
+          <w:right w:w="0" w:type="dxa"/>
+        </w:tblCellMar>
+        <w:tblLook w:firstRow="0" w:lastRow="0" w:firstColumn="0" w:lastColumn="0" w:noHBand="0" w:noVBand="0" w:val="0000"/>
+      </w:tblPr>
+      <w:tblGrid>
+        <w:gridCol w:w="7920"/>
+      </w:tblGrid>
+      <w:tr>
+        <w:trPr>
+          <w:cantSplit/>
+        </w:trPr>
+        <w:tc>
+          <w:tcPr>
+            <w:tcMar>
+              <w:left w:w="144" w:type="dxa"/>
+            </w:tcMar>
+          </w:tcPr>
+          <w:p>
+            <w:pPr>
+              <w:pStyle w:val="FirstParagraph"/>
+            </w:pPr>
+            <w:pPr>
+              <w:spacing w:before="16" w:after="64"/>
+            </w:pPr>
+          </w:p>
+          <w:bookmarkStart w:id="44" w:name="lem-var-sum"/>
+          <w:p>
+            <w:pPr>
+              <w:pStyle w:val="BodyText"/>
+            </w:pPr>
+            <w:r>
+              <w:rPr>
+                <w:b/>
+                <w:bCs/>
+              </w:rPr>
+              <w:t xml:space="preserve">Lemma 1 (Variance of a Sum)</w:t>
+            </w:r>
+            <w:r>
+              <w:t xml:space="preserve"> </w:t>
+            </w:r>
+            <w:r>
+              <w:t xml:space="preserve">For independent random variables</w:t>
+            </w:r>
+            <w:r>
+              <w:t xml:space="preserve"> </w:t>
+            </w:r>
+            <m:oMath>
+              <m:r>
+                <m:t>X</m:t>
+              </m:r>
+            </m:oMath>
+            <w:r>
+              <w:t xml:space="preserve"> </w:t>
+            </w:r>
+            <w:r>
+              <w:t xml:space="preserve">and</w:t>
+            </w:r>
+            <w:r>
+              <w:t xml:space="preserve"> </w:t>
+            </w:r>
+            <m:oMath>
+              <m:r>
+                <m:t>Y</m:t>
+              </m:r>
+            </m:oMath>
+            <w:r>
+              <w:t xml:space="preserve">:</w:t>
+            </w:r>
+          </w:p>
+          <w:p>
+            <w:pPr>
+              <w:pStyle w:val="BodyText"/>
+            </w:pPr>
+            <m:oMathPara>
+              <m:oMathParaPr>
+                <m:jc m:val="center"/>
+              </m:oMathParaPr>
+              <m:oMath>
+                <m:r>
+                  <m:rPr>
+                    <m:nor/>
+                    <m:sty m:val="p"/>
+                  </m:rPr>
+                  <m:t>Var</m:t>
+                </m:r>
+                <m:r>
+                  <m:rPr>
+                    <m:sty m:val="p"/>
+                  </m:rPr>
+                  <m:t>(</m:t>
+                </m:r>
+                <m:r>
+                  <m:t>X</m:t>
+                </m:r>
+                <m:r>
+                  <m:rPr>
+                    <m:sty m:val="p"/>
+                  </m:rPr>
+                  <m:t>+</m:t>
+                </m:r>
+                <m:r>
+                  <m:t>Y</m:t>
+                </m:r>
+                <m:r>
+                  <m:rPr>
+                    <m:sty m:val="p"/>
+                  </m:rPr>
+                  <m:t>)</m:t>
+                </m:r>
+                <m:r>
+                  <m:rPr>
+                    <m:sty m:val="p"/>
+                  </m:rPr>
+                  <m:t>=</m:t>
+                </m:r>
+                <m:r>
+                  <m:rPr>
+                    <m:nor/>
+                    <m:sty m:val="p"/>
+                  </m:rPr>
+                  <m:t>Var</m:t>
+                </m:r>
+                <m:r>
+                  <m:rPr>
+                    <m:sty m:val="p"/>
+                  </m:rPr>
+                  <m:t>(</m:t>
+                </m:r>
+                <m:r>
+                  <m:t>X</m:t>
+                </m:r>
+                <m:r>
+                  <m:rPr>
+                    <m:sty m:val="p"/>
+                  </m:rPr>
+                  <m:t>)</m:t>
+                </m:r>
+                <m:r>
+                  <m:rPr>
+                    <m:sty m:val="p"/>
+                  </m:rPr>
+                  <m:t>+</m:t>
+                </m:r>
+                <m:r>
+                  <m:rPr>
+                    <m:nor/>
+                    <m:sty m:val="p"/>
+                  </m:rPr>
+                  <m:t>Var</m:t>
+                </m:r>
+                <m:r>
+                  <m:rPr>
+                    <m:sty m:val="p"/>
+                  </m:rPr>
+                  <m:t>(</m:t>
+                </m:r>
+                <m:r>
+                  <m:t>Y</m:t>
+                </m:r>
+                <m:r>
+                  <m:rPr>
+                    <m:sty m:val="p"/>
+                  </m:rPr>
+                  <m:t>)</m:t>
+                </m:r>
+              </m:oMath>
+            </m:oMathPara>
+          </w:p>
+          <w:bookmarkEnd w:id="44"/>
+        </w:tc>
+      </w:tr>
+    </w:tbl>
+    <w:p>
+      <w:pPr>
+        <w:pStyle w:val="FirstParagraph"/>
+      </w:pPr>
+      <w:r>
+        <w:t xml:space="preserve"> </w:t>
+      </w:r>
+    </w:p>
+    <w:tbl>
+      <w:tblPr>
+        <w:tblStyle w:val="Table"/>
+        <w:tblInd w:w="164" w:type="dxa"/>
+        <w:tblBorders>
+          <w:left w:val="single" w:sz="24" w:space="0" w:color="0758E5"/>
+        </w:tblBorders>
+        <w:tblCellMar>
+          <w:left w:w="0" w:type="dxa"/>
+          <w:right w:w="0" w:type="dxa"/>
+        </w:tblCellMar>
+        <w:tblLook w:firstRow="0" w:lastRow="0" w:firstColumn="0" w:lastColumn="0" w:noHBand="0" w:noVBand="0" w:val="0000"/>
+      </w:tblPr>
+      <w:tblGrid>
+        <w:gridCol w:w="7920"/>
+      </w:tblGrid>
+      <w:tr>
+        <w:trPr>
+          <w:cantSplit/>
+        </w:trPr>
+        <w:tc>
+          <w:tcPr>
+            <w:tcMar>
+              <w:left w:w="144" w:type="dxa"/>
+            </w:tcMar>
+          </w:tcPr>
+          <w:p>
+            <w:pPr>
+              <w:pStyle w:val="BodyText"/>
+            </w:pPr>
+            <w:pPr>
+              <w:spacing w:before="16" w:after="64"/>
+            </w:pPr>
+          </w:p>
+          <w:bookmarkStart w:id="45" w:name="cor-se-clt"/>
+          <w:p>
+            <w:pPr>
+              <w:pStyle w:val="BodyText"/>
+            </w:pPr>
+            <w:r>
+              <w:rPr>
+                <w:b/>
+                <w:bCs/>
+              </w:rPr>
+              <w:t xml:space="preserve">Corollary 1 (Confidence Interval from CLT)</w:t>
+            </w:r>
+            <w:r>
+              <w:t xml:space="preserve"> </w:t>
+            </w:r>
+            <w:r>
+              <w:t xml:space="preserve">By</w:t>
+            </w:r>
+            <w:r>
+              <w:t xml:space="preserve"> </w:t>
+            </w:r>
+            <w:hyperlink w:anchor="thm-clt">
+              <w:r>
+                <w:rPr>
+                  <w:rStyle w:val="Hyperlink"/>
+                </w:rPr>
+                <w:t xml:space="preserve">Theorem 1</w:t>
+              </w:r>
+            </w:hyperlink>
+            <w:r>
+              <w:t xml:space="preserve"> </w:t>
+            </w:r>
+            <w:r>
+              <w:t xml:space="preserve">and</w:t>
+            </w:r>
+            <w:r>
+              <w:t xml:space="preserve"> </w:t>
+            </w:r>
+            <w:hyperlink w:anchor="def-se">
+              <w:r>
+                <w:rPr>
+                  <w:rStyle w:val="Hyperlink"/>
+                </w:rPr>
+                <w:t xml:space="preserve">Definition 1</w:t>
+              </w:r>
+            </w:hyperlink>
+            <w:r>
+              <w:t xml:space="preserve">, an approximate 95% confidence interval for</w:t>
+            </w:r>
+            <w:r>
+              <w:t xml:space="preserve"> </w:t>
+            </w:r>
+            <m:oMath>
+              <m:r>
+                <m:t>μ</m:t>
+              </m:r>
+            </m:oMath>
+            <w:r>
+              <w:t xml:space="preserve"> </w:t>
+            </w:r>
+            <w:r>
+              <w:t xml:space="preserve">is:</w:t>
+            </w:r>
+          </w:p>
+          <w:p>
+            <w:pPr>
+              <w:pStyle w:val="BodyText"/>
+            </w:pPr>
+            <m:oMathPara>
+              <m:oMathParaPr>
+                <m:jc m:val="center"/>
+              </m:oMathParaPr>
+              <m:oMath>
+                <m:acc>
+                  <m:accPr>
+                    <m:chr m:val="‾"/>
+                  </m:accPr>
+                  <m:e>
+                    <m:r>
+                      <m:t>x</m:t>
+                    </m:r>
+                  </m:e>
+                </m:acc>
+                <m:r>
+                  <m:rPr>
+                    <m:sty m:val="p"/>
+                  </m:rPr>
+                  <m:t>±</m:t>
+                </m:r>
+                <m:r>
+                  <m:t>1.96</m:t>
+                </m:r>
+                <m:r>
+                  <m:rPr>
+                    <m:sty m:val="p"/>
+                  </m:rPr>
+                  <m:t>⋅</m:t>
+                </m:r>
+                <m:r>
+                  <m:t>S</m:t>
+                </m:r>
+                <m:r>
+                  <m:t>E</m:t>
+                </m:r>
+              </m:oMath>
+            </m:oMathPara>
+          </w:p>
+          <w:bookmarkEnd w:id="45"/>
+        </w:tc>
+      </w:tr>
+    </w:tbl>
+    <w:bookmarkEnd w:id="46"/>
+    <w:bookmarkStart w:id="49" w:name="examples-and-exercises"/>
+    <w:p>
+      <w:pPr>
+        <w:pStyle w:val="Heading3"/>
+      </w:pPr>
+      <w:r>
+        <w:t xml:space="preserve">6.3 Examples and Exercises</w:t>
+      </w:r>
+    </w:p>
+    <w:tbl>
+      <w:tblPr>
+        <w:tblStyle w:val="Table"/>
+        <w:tblInd w:w="164" w:type="dxa"/>
+        <w:tblBorders>
+          <w:left w:val="single" w:sz="24" w:space="0" w:color="00A047"/>
+        </w:tblBorders>
+        <w:tblCellMar>
+          <w:left w:w="0" w:type="dxa"/>
+          <w:right w:w="0" w:type="dxa"/>
+        </w:tblCellMar>
+        <w:tblLook w:firstRow="0" w:lastRow="0" w:firstColumn="0" w:lastColumn="0" w:noHBand="0" w:noVBand="0" w:val="0000"/>
+      </w:tblPr>
+      <w:tblGrid>
+        <w:gridCol w:w="7920"/>
+      </w:tblGrid>
+      <w:tr>
+        <w:trPr>
+          <w:cantSplit/>
+        </w:trPr>
+        <w:tc>
+          <w:tcPr>
+            <w:tcMar>
+              <w:left w:w="144" w:type="dxa"/>
+            </w:tcMar>
+          </w:tcPr>
+          <w:p>
+            <w:pPr>
+              <w:pStyle w:val="FirstParagraph"/>
+            </w:pPr>
+            <w:pPr>
+              <w:spacing w:before="16" w:after="64"/>
+            </w:pPr>
+          </w:p>
+          <w:bookmarkStart w:id="47" w:name="exm-ci"/>
+          <w:p>
+            <w:pPr>
+              <w:pStyle w:val="BodyText"/>
+            </w:pPr>
+            <w:r>
+              <w:rPr>
+                <w:b/>
+                <w:bCs/>
+              </w:rPr>
+              <w:t xml:space="preserve">Example 1 (95% Confidence Interval)</w:t>
+            </w:r>
+            <w:r>
+              <w:t xml:space="preserve"> </w:t>
+            </w:r>
+            <w:r>
+              <w:t xml:space="preserve">For the sample below, we calculate a 95% confidence interval for the mean:</w:t>
+            </w:r>
+          </w:p>
+          <w:p>
+            <w:pPr>
+              <w:pStyle w:val="SourceCode"/>
+            </w:pPr>
+            <w:r>
+              <w:rPr>
+                <w:rStyle w:val="FunctionTok"/>
+              </w:rPr>
+              <w:t xml:space="preserve">set.seed</w:t>
+            </w:r>
+            <w:r>
+              <w:rPr>
+                <w:rStyle w:val="NormalTok"/>
+              </w:rPr>
+              <w:t xml:space="preserve">(</w:t>
+            </w:r>
+            <w:r>
+              <w:rPr>
+                <w:rStyle w:val="DecValTok"/>
+              </w:rPr>
+              <w:t xml:space="preserve">42</w:t>
+            </w:r>
+            <w:r>
+              <w:rPr>
+                <w:rStyle w:val="NormalTok"/>
+              </w:rPr>
+              <w:t xml:space="preserve">)</w:t>
+            </w:r>
+            <w:r>
+              <w:br/>
+            </w:r>
+            <w:r>
+              <w:rPr>
+                <w:rStyle w:val="NormalTok"/>
+              </w:rPr>
+              <w:t xml:space="preserve">sample_vals </w:t>
+            </w:r>
+            <w:r>
+              <w:rPr>
+                <w:rStyle w:val="OtherTok"/>
+              </w:rPr>
+              <w:t xml:space="preserve">&lt;-</w:t>
+            </w:r>
+            <w:r>
+              <w:rPr>
+                <w:rStyle w:val="NormalTok"/>
+              </w:rPr>
+              <w:t xml:space="preserve"> </w:t>
+            </w:r>
+            <w:r>
+              <w:rPr>
+                <w:rStyle w:val="FunctionTok"/>
+              </w:rPr>
+              <w:t xml:space="preserve">rnorm</w:t>
+            </w:r>
+            <w:r>
+              <w:rPr>
+                <w:rStyle w:val="NormalTok"/>
+              </w:rPr>
+              <w:t xml:space="preserve">(</w:t>
+            </w:r>
+            <w:r>
+              <w:rPr>
+                <w:rStyle w:val="DecValTok"/>
+              </w:rPr>
+              <w:t xml:space="preserve">50</w:t>
+            </w:r>
+            <w:r>
+              <w:rPr>
+                <w:rStyle w:val="NormalTok"/>
+              </w:rPr>
+              <w:t xml:space="preserve">, </w:t>
+            </w:r>
+            <w:r>
+              <w:rPr>
+                <w:rStyle w:val="AttributeTok"/>
+              </w:rPr>
+              <w:t xml:space="preserve">mean =</w:t>
+            </w:r>
+            <w:r>
+              <w:rPr>
+                <w:rStyle w:val="NormalTok"/>
+              </w:rPr>
+              <w:t xml:space="preserve"> </w:t>
+            </w:r>
+            <w:r>
+              <w:rPr>
+                <w:rStyle w:val="DecValTok"/>
+              </w:rPr>
+              <w:t xml:space="preserve">5</w:t>
+            </w:r>
+            <w:r>
+              <w:rPr>
+                <w:rStyle w:val="NormalTok"/>
+              </w:rPr>
+              <w:t xml:space="preserve">, </w:t>
+            </w:r>
+            <w:r>
+              <w:rPr>
+                <w:rStyle w:val="AttributeTok"/>
+              </w:rPr>
+              <w:t xml:space="preserve">sd =</w:t>
+            </w:r>
+            <w:r>
+              <w:rPr>
+                <w:rStyle w:val="NormalTok"/>
+              </w:rPr>
+              <w:t xml:space="preserve"> </w:t>
+            </w:r>
+            <w:r>
+              <w:rPr>
+                <w:rStyle w:val="DecValTok"/>
+              </w:rPr>
+              <w:t xml:space="preserve">2</w:t>
+            </w:r>
+            <w:r>
+              <w:rPr>
+                <w:rStyle w:val="NormalTok"/>
+              </w:rPr>
+              <w:t xml:space="preserve">)</w:t>
+            </w:r>
+            <w:r>
+              <w:br/>
+            </w:r>
+            <w:r>
+              <w:rPr>
+                <w:rStyle w:val="NormalTok"/>
+              </w:rPr>
+              <w:t xml:space="preserve">n </w:t>
+            </w:r>
+            <w:r>
+              <w:rPr>
+                <w:rStyle w:val="OtherTok"/>
+              </w:rPr>
+              <w:t xml:space="preserve">&lt;-</w:t>
+            </w:r>
+            <w:r>
+              <w:rPr>
+                <w:rStyle w:val="NormalTok"/>
+              </w:rPr>
+              <w:t xml:space="preserve"> </w:t>
+            </w:r>
+            <w:r>
+              <w:rPr>
+                <w:rStyle w:val="FunctionTok"/>
+              </w:rPr>
+              <w:t xml:space="preserve">length</w:t>
+            </w:r>
+            <w:r>
+              <w:rPr>
+                <w:rStyle w:val="NormalTok"/>
+              </w:rPr>
+              <w:t xml:space="preserve">(sample_vals)</w:t>
+            </w:r>
+            <w:r>
+              <w:br/>
+            </w:r>
+            <w:r>
+              <w:rPr>
+                <w:rStyle w:val="NormalTok"/>
+              </w:rPr>
+              <w:t xml:space="preserve">se </w:t>
+            </w:r>
+            <w:r>
+              <w:rPr>
+                <w:rStyle w:val="OtherTok"/>
+              </w:rPr>
+              <w:t xml:space="preserve">&lt;-</w:t>
+            </w:r>
+            <w:r>
+              <w:rPr>
+                <w:rStyle w:val="NormalTok"/>
+              </w:rPr>
+              <w:t xml:space="preserve"> </w:t>
+            </w:r>
+            <w:r>
+              <w:rPr>
+                <w:rStyle w:val="FunctionTok"/>
+              </w:rPr>
+              <w:t xml:space="preserve">sd</w:t>
+            </w:r>
+            <w:r>
+              <w:rPr>
+                <w:rStyle w:val="NormalTok"/>
+              </w:rPr>
+              <w:t xml:space="preserve">(sample_vals) </w:t>
+            </w:r>
+            <w:r>
+              <w:rPr>
+                <w:rStyle w:val="SpecialCharTok"/>
+              </w:rPr>
+              <w:t xml:space="preserve">/</w:t>
+            </w:r>
+            <w:r>
+              <w:rPr>
+                <w:rStyle w:val="NormalTok"/>
+              </w:rPr>
+              <w:t xml:space="preserve"> </w:t>
+            </w:r>
+            <w:r>
+              <w:rPr>
+                <w:rStyle w:val="FunctionTok"/>
+              </w:rPr>
+              <w:t xml:space="preserve">sqrt</w:t>
+            </w:r>
+            <w:r>
+              <w:rPr>
+                <w:rStyle w:val="NormalTok"/>
+              </w:rPr>
+              <w:t xml:space="preserve">(n)</w:t>
+            </w:r>
+            <w:r>
+              <w:br/>
+            </w:r>
+            <w:r>
+              <w:rPr>
+                <w:rStyle w:val="NormalTok"/>
+              </w:rPr>
+              <w:t xml:space="preserve">ci </w:t>
+            </w:r>
+            <w:r>
+              <w:rPr>
+                <w:rStyle w:val="OtherTok"/>
+              </w:rPr>
+              <w:t xml:space="preserve">&lt;-</w:t>
+            </w:r>
+            <w:r>
+              <w:rPr>
+                <w:rStyle w:val="NormalTok"/>
+              </w:rPr>
+              <w:t xml:space="preserve"> </w:t>
+            </w:r>
+            <w:r>
+              <w:rPr>
+                <w:rStyle w:val="FunctionTok"/>
+              </w:rPr>
+              <w:t xml:space="preserve">mean</w:t>
+            </w:r>
+            <w:r>
+              <w:rPr>
+                <w:rStyle w:val="NormalTok"/>
+              </w:rPr>
+              <w:t xml:space="preserve">(sample_vals) </w:t>
+            </w:r>
+            <w:r>
+              <w:rPr>
+                <w:rStyle w:val="SpecialCharTok"/>
+              </w:rPr>
+              <w:t xml:space="preserve">+</w:t>
+            </w:r>
+            <w:r>
+              <w:rPr>
+                <w:rStyle w:val="NormalTok"/>
+              </w:rPr>
+              <w:t xml:space="preserve"> </w:t>
+            </w:r>
+            <w:r>
+              <w:rPr>
+                <w:rStyle w:val="FunctionTok"/>
+              </w:rPr>
+              <w:t xml:space="preserve">c</w:t>
+            </w:r>
+            <w:r>
+              <w:rPr>
+                <w:rStyle w:val="NormalTok"/>
+              </w:rPr>
+              <w:t xml:space="preserve">(</w:t>
+            </w:r>
+            <w:r>
+              <w:rPr>
+                <w:rStyle w:val="SpecialCharTok"/>
+              </w:rPr>
+              <w:t xml:space="preserve">-</w:t>
+            </w:r>
+            <w:r>
+              <w:rPr>
+                <w:rStyle w:val="DecValTok"/>
+              </w:rPr>
+              <w:t xml:space="preserve">1</w:t>
+            </w:r>
+            <w:r>
+              <w:rPr>
+                <w:rStyle w:val="NormalTok"/>
+              </w:rPr>
+              <w:t xml:space="preserve">, </w:t>
+            </w:r>
+            <w:r>
+              <w:rPr>
+                <w:rStyle w:val="DecValTok"/>
+              </w:rPr>
+              <w:t xml:space="preserve">1</w:t>
+            </w:r>
+            <w:r>
+              <w:rPr>
+                <w:rStyle w:val="NormalTok"/>
+              </w:rPr>
+              <w:t xml:space="preserve">) </w:t>
+            </w:r>
+            <w:r>
+              <w:rPr>
+                <w:rStyle w:val="SpecialCharTok"/>
+              </w:rPr>
+              <w:t xml:space="preserve">*</w:t>
+            </w:r>
+            <w:r>
+              <w:rPr>
+                <w:rStyle w:val="NormalTok"/>
+              </w:rPr>
+              <w:t xml:space="preserve"> </w:t>
+            </w:r>
+            <w:r>
+              <w:rPr>
+                <w:rStyle w:val="FloatTok"/>
+              </w:rPr>
+              <w:t xml:space="preserve">1.96</w:t>
+            </w:r>
+            <w:r>
+              <w:rPr>
+                <w:rStyle w:val="NormalTok"/>
+              </w:rPr>
+              <w:t xml:space="preserve"> </w:t>
+            </w:r>
+            <w:r>
+              <w:rPr>
+                <w:rStyle w:val="SpecialCharTok"/>
+              </w:rPr>
+              <w:t xml:space="preserve">*</w:t>
+            </w:r>
+            <w:r>
+              <w:rPr>
+                <w:rStyle w:val="NormalTok"/>
+              </w:rPr>
+              <w:t xml:space="preserve"> se</w:t>
+            </w:r>
+            <w:r>
+              <w:br/>
+            </w:r>
+            <w:r>
+              <w:rPr>
+                <w:rStyle w:val="FunctionTok"/>
+              </w:rPr>
+              <w:t xml:space="preserve">cat</w:t>
+            </w:r>
+            <w:r>
+              <w:rPr>
+                <w:rStyle w:val="NormalTok"/>
+              </w:rPr>
+              <w:t xml:space="preserve">(</w:t>
+            </w:r>
+            <w:r>
+              <w:rPr>
+                <w:rStyle w:val="FunctionTok"/>
+              </w:rPr>
+              <w:t xml:space="preserve">sprintf</w:t>
+            </w:r>
+            <w:r>
+              <w:rPr>
+                <w:rStyle w:val="NormalTok"/>
+              </w:rPr>
+              <w:t xml:space="preserve">(</w:t>
+            </w:r>
+            <w:r>
+              <w:rPr>
+                <w:rStyle w:val="StringTok"/>
+              </w:rPr>
+              <w:t xml:space="preserve">"Mean = %.3f, 95%% CI: [%.3f, %.3f]</w:t>
+            </w:r>
+            <w:r>
+              <w:rPr>
+                <w:rStyle w:val="SpecialCharTok"/>
+              </w:rPr>
+              <w:t xml:space="preserve">\n</w:t>
+            </w:r>
+            <w:r>
+              <w:rPr>
+                <w:rStyle w:val="StringTok"/>
+              </w:rPr>
+              <w:t xml:space="preserve">"</w:t>
+            </w:r>
+            <w:r>
+              <w:rPr>
+                <w:rStyle w:val="NormalTok"/>
+              </w:rPr>
+              <w:t xml:space="preserve">, </w:t>
+            </w:r>
+            <w:r>
+              <w:rPr>
+                <w:rStyle w:val="FunctionTok"/>
+              </w:rPr>
+              <w:t xml:space="preserve">mean</w:t>
+            </w:r>
+            <w:r>
+              <w:rPr>
+                <w:rStyle w:val="NormalTok"/>
+              </w:rPr>
+              <w:t xml:space="preserve">(sample_vals), ci[</w:t>
+            </w:r>
+            <w:r>
+              <w:rPr>
+                <w:rStyle w:val="DecValTok"/>
+              </w:rPr>
+              <w:t xml:space="preserve">1</w:t>
+            </w:r>
+            <w:r>
+              <w:rPr>
+                <w:rStyle w:val="NormalTok"/>
+              </w:rPr>
+              <w:t xml:space="preserve">], ci[</w:t>
+            </w:r>
+            <w:r>
+              <w:rPr>
+                <w:rStyle w:val="DecValTok"/>
+              </w:rPr>
+              <w:t xml:space="preserve">2</w:t>
+            </w:r>
+            <w:r>
+              <w:rPr>
+                <w:rStyle w:val="NormalTok"/>
+              </w:rPr>
+              <w:t xml:space="preserve">]))</w:t>
+            </w:r>
+            <w:r>
+              <w:br/>
+            </w:r>
+            <w:r>
+              <w:rPr>
+                <w:rStyle w:val="CommentTok"/>
+              </w:rPr>
+              <w:t xml:space="preserve">#&gt; Mean = 4.929, 95% CI: [4.290, 5.567]</w:t>
+            </w:r>
+          </w:p>
+          <w:bookmarkEnd w:id="47"/>
+        </w:tc>
+      </w:tr>
+    </w:tbl>
+    <w:p>
+      <w:pPr>
+        <w:pStyle w:val="FirstParagraph"/>
+      </w:pPr>
+      <w:r>
+        <w:t xml:space="preserve"> </w:t>
+      </w:r>
+    </w:p>
+    <w:tbl>
+      <w:tblPr>
+        <w:tblStyle w:val="Table"/>
+        <w:tblInd w:w="164" w:type="dxa"/>
+        <w:tblBorders>
+          <w:left w:val="single" w:sz="24" w:space="0" w:color="00A047"/>
+        </w:tblBorders>
+        <w:tblCellMar>
+          <w:left w:w="0" w:type="dxa"/>
+          <w:right w:w="0" w:type="dxa"/>
+        </w:tblCellMar>
+        <w:tblLook w:firstRow="0" w:lastRow="0" w:firstColumn="0" w:lastColumn="0" w:noHBand="0" w:noVBand="0" w:val="0000"/>
+      </w:tblPr>
+      <w:tblGrid>
+        <w:gridCol w:w="7920"/>
+      </w:tblGrid>
+      <w:tr>
+        <w:trPr>
+          <w:cantSplit/>
+        </w:trPr>
+        <w:tc>
+          <w:tcPr>
+            <w:tcMar>
+              <w:left w:w="144" w:type="dxa"/>
+            </w:tcMar>
+          </w:tcPr>
+          <w:p>
+            <w:pPr>
+              <w:pStyle w:val="BodyText"/>
+            </w:pPr>
+            <w:pPr>
+              <w:spacing w:before="16" w:after="64"/>
+            </w:pPr>
+          </w:p>
+          <w:bookmarkStart w:id="48" w:name="exr-se"/>
+          <w:p>
+            <w:pPr>
+              <w:pStyle w:val="BodyText"/>
+            </w:pPr>
+            <w:r>
+              <w:rPr>
+                <w:b/>
+                <w:bCs/>
+              </w:rPr>
+              <w:t xml:space="preserve">Exercise 1 (Exercise: Computing Standard Error)</w:t>
+            </w:r>
+            <w:r>
+              <w:t xml:space="preserve"> </w:t>
+            </w:r>
+            <w:r>
+              <w:t xml:space="preserve">Compute the standard error for a sample of size</w:t>
+            </w:r>
+            <w:r>
+              <w:t xml:space="preserve"> </w:t>
+            </w:r>
+            <m:oMath>
+              <m:r>
+                <m:t>n</m:t>
+              </m:r>
+              <m:r>
+                <m:rPr>
+                  <m:sty m:val="p"/>
+                </m:rPr>
+                <m:t>=</m:t>
+              </m:r>
+              <m:r>
+                <m:t>100</m:t>
+              </m:r>
+            </m:oMath>
+            <w:r>
+              <w:t xml:space="preserve"> </w:t>
+            </w:r>
+            <w:r>
+              <w:t xml:space="preserve">with sample standard deviation</w:t>
+            </w:r>
+            <w:r>
+              <w:t xml:space="preserve"> </w:t>
+            </w:r>
+            <m:oMath>
+              <m:r>
+                <m:t>s</m:t>
+              </m:r>
+              <m:r>
+                <m:rPr>
+                  <m:sty m:val="p"/>
+                </m:rPr>
+                <m:t>=</m:t>
+              </m:r>
+              <m:r>
+                <m:t>15</m:t>
+              </m:r>
+            </m:oMath>
+            <w:r>
+              <w:t xml:space="preserve">.</w:t>
+            </w:r>
+          </w:p>
+          <w:bookmarkEnd w:id="48"/>
+        </w:tc>
+      </w:tr>
+    </w:tbl>
+    <w:p>
+      <w:pPr>
+        <w:pStyle w:val="BodyText"/>
+      </w:pPr>
+      <w:r>
+        <w:t xml:space="preserve"> </w:t>
+      </w:r>
+    </w:p>
+    <w:tbl>
+      <w:tblPr>
+        <w:tblStyle w:val="Table"/>
+        <w:tblLook w:firstRow="0" w:lastRow="0" w:firstColumn="0" w:lastColumn="0" w:noHBand="0" w:noVBand="0" w:val="0000"/>
+        <w:tblBorders>
+          <w:top w:val="single" w:sz="4" w:space="0" w:color="0758E5"/>
+          <w:left w:val="single" w:sz="24" w:space="0" w:color="0758E5"/>
+          <w:bottom w:val="single" w:sz="4" w:space="0" w:color="0758E5"/>
+          <w:right w:val="single" w:sz="4" w:space="0" w:color="0758E5"/>
+        </w:tblBorders>
+        <w:tblCellMar>
+          <w:left w:w="144" w:type="dxa"/>
+          <w:right w:w="144" w:type="dxa"/>
+        </w:tblCellMar>
+        <w:tblLook w:firstRow="0" w:lastRow="0" w:firstColumn="0" w:lastColumn="0" w:noHBand="0" w:noVBand="0" w:val="0000"/>
+      </w:tblPr>
+      <w:tr>
+        <w:trPr>
+          <w:cantSplit/>
+        </w:trPr>
+        <w:tc>
+          <w:tcPr>
+            <w:shd w:color="auto" w:fill="dae6fb" w:val="clear"/>
+            <w:tcMar>
+              <w:top w:w="92" w:type="dxa"/>
+              <w:bottom w:w="92" w:type="dxa"/>
+            </w:tcMar>
+          </w:tcPr>
+          <w:p>
+            <w:pPr>
+              <w:pStyle w:val="BodyText"/>
+            </w:pPr>
+            <w:pPr>
+              <w:spacing w:before="16" w:after="16"/>
+            </w:pPr>
+            <w:r>
+              <w:t xml:space="preserve">Solution</w:t>
+            </w:r>
+          </w:p>
+        </w:tc>
+      </w:tr>
+      <w:tr>
+        <w:trPr>
+          <w:cantSplit/>
+        </w:trPr>
+        <w:tc>
+          <w:tcPr>
+            <w:tcMar>
+              <w:top w:w="108" w:type="dxa"/>
+              <w:bottom w:w="108" w:type="dxa"/>
+            </w:tcMar>
+          </w:tcPr>
+          <w:p>
+            <w:pPr>
+              <w:pStyle w:val="BodyText"/>
+            </w:pPr>
+            <w:r>
+              <w:rPr>
+                <w:i/>
+                <w:iCs/>
+              </w:rPr>
+              <w:t xml:space="preserve">Solution</w:t>
+            </w:r>
+            <w:r>
+              <w:t xml:space="preserve">. </w:t>
+            </w:r>
+          </w:p>
+          <w:p>
+            <w:pPr>
+              <w:pStyle w:val="BodyText"/>
+            </w:pPr>
+            <m:oMathPara>
+              <m:oMathParaPr>
+                <m:jc m:val="center"/>
+              </m:oMathParaPr>
+              <m:oMath>
+                <m:r>
+                  <m:t>S</m:t>
+                </m:r>
+                <m:r>
+                  <m:t>E</m:t>
+                </m:r>
+                <m:r>
+                  <m:rPr>
+                    <m:sty m:val="p"/>
+                  </m:rPr>
+                  <m:t>=</m:t>
+                </m:r>
+                <m:f>
+                  <m:fPr>
+                    <m:type m:val="bar"/>
+                  </m:fPr>
+                  <m:num>
+                    <m:r>
+                      <m:t>15</m:t>
+                    </m:r>
+                  </m:num>
+                  <m:den>
+                    <m:rad>
+                      <m:radPr>
+                        <m:degHide m:val="on"/>
+                      </m:radPr>
+                      <m:deg/>
+                      <m:e>
+                        <m:r>
+                          <m:t>100</m:t>
+                        </m:r>
+                      </m:e>
+                    </m:rad>
+                  </m:den>
+                </m:f>
+                <m:r>
+                  <m:rPr>
+                    <m:sty m:val="p"/>
+                  </m:rPr>
+                  <m:t>=</m:t>
+                </m:r>
+                <m:f>
+                  <m:fPr>
+                    <m:type m:val="bar"/>
+                  </m:fPr>
+                  <m:num>
+                    <m:r>
+                      <m:t>15</m:t>
+                    </m:r>
+                  </m:num>
+                  <m:den>
+                    <m:r>
+                      <m:t>10</m:t>
+                    </m:r>
+                  </m:den>
+                </m:f>
+                <m:r>
+                  <m:rPr>
+                    <m:sty m:val="p"/>
+                  </m:rPr>
+                  <m:t>=</m:t>
+                </m:r>
+                <m:r>
+                  <m:t>1.5</m:t>
+                </m:r>
+              </m:oMath>
+            </m:oMathPara>
+          </w:p>
+          <w:p/>
+        </w:tc>
+      </w:tr>
+    </w:tbl>
+    <w:bookmarkEnd w:id="49"/>
+    <w:bookmarkEnd w:id="50"/>
+    <w:bookmarkStart w:id="51" w:name="mathematical-notation"/>
+    <w:p>
+      <w:pPr>
+        <w:pStyle w:val="Heading2"/>
+      </w:pPr>
+      <w:r>
+        <w:t xml:space="preserve">7 Mathematical Notation</w:t>
       </w:r>
     </w:p>
     <w:p>
@@ -3508,14 +5231,14 @@
         </m:oMath>
       </m:oMathPara>
     </w:p>
-    <w:bookmarkEnd w:id="38"/>
-    <w:bookmarkStart w:id="42" w:name="tips-and-best-practices"/>
+    <w:bookmarkEnd w:id="51"/>
+    <w:bookmarkStart w:id="55" w:name="tips-and-best-practices"/>
     <w:p>
       <w:pPr>
         <w:pStyle w:val="Heading2"/>
       </w:pPr>
       <w:r>
-        <w:t xml:space="preserve">7 Tips and Best Practices</w:t>
+        <w:t xml:space="preserve">8 Tips and Best Practices</w:t>
       </w:r>
     </w:p>
     <w:tbl>
@@ -3559,18 +5282,18 @@
                 <wp:inline>
                   <wp:extent cx="152400" cy="152400"/>
                   <wp:effectExtent b="0" l="0" r="0" t="0"/>
-                  <wp:docPr descr="" title="" id="40" name="Picture"/>
+                  <wp:docPr descr="" title="" id="53" name="Picture"/>
                   <a:graphic>
                     <a:graphicData uri="http://schemas.openxmlformats.org/drawingml/2006/picture">
                       <pic:pic>
                         <pic:nvPicPr>
-                          <pic:cNvPr descr="/opt/quarto/share/formats/docx/tip.png" id="41" name="Picture"/>
+                          <pic:cNvPr descr="/opt/quarto/share/formats/docx/tip.png" id="54" name="Picture"/>
                           <pic:cNvPicPr>
                             <a:picLocks noChangeArrowheads="1" noChangeAspect="1"/>
                           </pic:cNvPicPr>
                         </pic:nvPicPr>
                         <pic:blipFill>
-                          <a:blip r:embed="rId39"/>
+                          <a:blip r:embed="rId52"/>
                           <a:stretch>
                             <a:fillRect/>
                           </a:stretch>
@@ -3694,14 +5417,14 @@
         </w:tc>
       </w:tr>
     </w:tbl>
-    <w:bookmarkEnd w:id="42"/>
-    <w:bookmarkStart w:id="43" w:name="conclusion"/>
+    <w:bookmarkEnd w:id="55"/>
+    <w:bookmarkStart w:id="56" w:name="conclusion"/>
     <w:p>
       <w:pPr>
         <w:pStyle w:val="Heading2"/>
       </w:pPr>
       <w:r>
-        <w:t xml:space="preserve">8 Conclusion</w:t>
+        <w:t xml:space="preserve">9 Conclusion</w:t>
       </w:r>
     </w:p>
     <w:p>
@@ -3712,14 +5435,14 @@
         <w:t xml:space="preserve">This article demonstrates the advanced capabilities of Quarto for creating rich, interactive documentation for R packages.</w:t>
       </w:r>
     </w:p>
-    <w:bookmarkEnd w:id="43"/>
-    <w:bookmarkStart w:id="47" w:name="learn-more"/>
+    <w:bookmarkEnd w:id="56"/>
+    <w:bookmarkStart w:id="60" w:name="learn-more"/>
     <w:p>
       <w:pPr>
         <w:pStyle w:val="Heading2"/>
       </w:pPr>
       <w:r>
-        <w:t xml:space="preserve">9 Learn More</w:t>
+        <w:t xml:space="preserve">10 Learn More</w:t>
       </w:r>
     </w:p>
     <w:p>
@@ -3736,7 +5459,7 @@
       <w:r>
         <w:t xml:space="preserve"> </w:t>
       </w:r>
-      <w:hyperlink r:id="rId44">
+      <w:hyperlink r:id="rId57">
         <w:r>
           <w:rPr>
             <w:rStyle w:val="Hyperlink"/>
@@ -3759,7 +5482,7 @@
       <w:r>
         <w:t xml:space="preserve"> </w:t>
       </w:r>
-      <w:hyperlink r:id="rId45">
+      <w:hyperlink r:id="rId58">
         <w:r>
           <w:rPr>
             <w:rStyle w:val="Hyperlink"/>
@@ -3782,7 +5505,7 @@
       <w:r>
         <w:t xml:space="preserve"> </w:t>
       </w:r>
-      <w:hyperlink r:id="rId46">
+      <w:hyperlink r:id="rId59">
         <w:r>
           <w:rPr>
             <w:rStyle w:val="Hyperlink"/>
@@ -3791,19 +5514,19 @@
         </w:r>
       </w:hyperlink>
     </w:p>
-    <w:bookmarkEnd w:id="47"/>
-    <w:bookmarkStart w:id="49" w:name="references"/>
+    <w:bookmarkEnd w:id="60"/>
+    <w:bookmarkStart w:id="62" w:name="references"/>
     <w:p>
       <w:pPr>
         <w:pStyle w:val="Heading2"/>
       </w:pPr>
       <w:r>
-        <w:t xml:space="preserve">10 References</w:t>
-      </w:r>
-    </w:p>
-    <w:bookmarkStart w:id="48" w:name="refs"/>
-    <w:bookmarkEnd w:id="48"/>
-    <w:bookmarkEnd w:id="49"/>
+        <w:t xml:space="preserve">11 References</w:t>
+      </w:r>
+    </w:p>
+    <w:bookmarkStart w:id="61" w:name="refs"/>
+    <w:bookmarkEnd w:id="61"/>
+    <w:bookmarkEnd w:id="62"/>
     <w:sectPr>
       <w:footnotePr>
         <w:numRestart w:val="eachSect"/>

</xml_diff>